<commit_message>
Split stacked signature paragraphs when parsing cost norm docx
Co-Authored-By: Claude Opus 4.7 (1M context) <noreply@anthropic.com>
</commit_message>
<xml_diff>
--- a/client/public/namuna_meyoriy_sarf.docx
+++ b/client/public/namuna_meyoriy_sarf.docx
@@ -2148,7 +2148,7 @@
       </w:tr>
       <w:tr>
         <w:trPr>
-          <w:trHeight w:val="332"/>
+          <w:trHeight w:val="384"/>
         </w:trPr>
         <w:tc>
           <w:tcPr>
@@ -2171,45 +2171,6 @@
                 <w:lang w:val="uz-Cyrl-UZ"/>
               </w:rPr>
               <w:t>Технолог</w:t>
-            </w:r>
-          </w:p>
-          <w:p>
-            <w:pPr>
-              <w:rPr>
-                <w:bCs/>
-                <w:sz w:val="28"/>
-                <w:szCs w:val="28"/>
-                <w:lang w:val="uz-Cyrl-UZ"/>
-              </w:rPr>
-            </w:pPr>
-          </w:p>
-          <w:p>
-            <w:pPr>
-              <w:rPr>
-                <w:bCs/>
-                <w:sz w:val="28"/>
-                <w:szCs w:val="28"/>
-                <w:lang w:val="uz-Cyrl-UZ"/>
-              </w:rPr>
-            </w:pPr>
-          </w:p>
-          <w:p>
-            <w:pPr>
-              <w:rPr>
-                <w:bCs/>
-                <w:sz w:val="28"/>
-                <w:szCs w:val="28"/>
-                <w:lang w:val="uz-Cyrl-UZ"/>
-              </w:rPr>
-            </w:pPr>
-            <w:r>
-              <w:rPr>
-                <w:bCs/>
-                <w:sz w:val="28"/>
-                <w:szCs w:val="28"/>
-                <w:lang w:val="uz-Cyrl-UZ"/>
-              </w:rPr>
-              <w:t>Конструктор</w:t>
             </w:r>
           </w:p>
         </w:tc>
@@ -2234,81 +2195,104 @@
           </w:tcPr>
           <w:p>
             <w:pPr>
-              <w:jc w:val="center"/>
-              <w:rPr>
-                <w:sz w:val="28"/>
-                <w:szCs w:val="28"/>
-                <w:lang w:val="uz-Cyrl-UZ"/>
-              </w:rPr>
-            </w:pPr>
-            <w:r>
-              <w:rPr>
-                <w:sz w:val="28"/>
-                <w:szCs w:val="28"/>
-                <w:lang w:val="uz-Cyrl-UZ"/>
-              </w:rPr>
-              <w:t xml:space="preserve">                 ______________</w:t>
-            </w:r>
-          </w:p>
-          <w:p>
-            <w:pPr>
-              <w:jc w:val="center"/>
-              <w:rPr>
-                <w:sz w:val="28"/>
-                <w:szCs w:val="28"/>
-                <w:lang w:val="uz-Cyrl-UZ"/>
-              </w:rPr>
-            </w:pPr>
-          </w:p>
-          <w:p>
-            <w:pPr>
-              <w:jc w:val="center"/>
-              <w:rPr>
-                <w:sz w:val="28"/>
-                <w:szCs w:val="28"/>
-                <w:lang w:val="uz-Cyrl-UZ"/>
-              </w:rPr>
-            </w:pPr>
-            <w:r>
-              <w:rPr>
-                <w:sz w:val="28"/>
-                <w:szCs w:val="28"/>
-                <w:lang w:val="uz-Cyrl-UZ"/>
-              </w:rPr>
-              <w:t xml:space="preserve">                  </w:t>
-            </w:r>
-            <w:r>
-              <w:rPr>
-                <w:sz w:val="28"/>
-                <w:szCs w:val="28"/>
-                <w:lang w:val="uz-Cyrl-UZ"/>
-              </w:rPr>
-              <w:t xml:space="preserve">          </w:t>
-            </w:r>
-            <w:r>
-              <w:rPr>
-                <w:sz w:val="28"/>
-                <w:szCs w:val="28"/>
-                <w:lang w:val="uz-Cyrl-UZ"/>
-              </w:rPr>
-              <w:t/>
-            </w:r>
-            <w:r>
-              <w:rPr>
-                <w:sz w:val="28"/>
-                <w:szCs w:val="28"/>
-                <w:lang w:val="uz-Cyrl-UZ"/>
-              </w:rPr>
-              <w:t xml:space="preserve"> </w:t>
-            </w:r>
-            <w:r>
-              <w:rPr>
-                <w:sz w:val="28"/>
-                <w:szCs w:val="28"/>
-                <w:lang w:val="uz-Cyrl-UZ"/>
-              </w:rPr>
-              <w:t/>
-            </w:r>
+              <w:rPr>
+                <w:sz w:val="28"/>
+                <w:szCs w:val="28"/>
+                <w:lang w:val="uz-Cyrl-UZ"/>
+              </w:rPr>
+            </w:pPr>
+            <w:r>
+              <w:rPr>
+                <w:sz w:val="28"/>
+                <w:szCs w:val="28"/>
+                <w:lang w:val="uz-Cyrl-UZ"/>
+              </w:rPr>
+              <w:t xml:space="preserve">                            ______________</w:t>
+            </w:r>
+          </w:p>
+          <w:p>
+            <w:pPr>
+              <w:rPr>
+                <w:sz w:val="28"/>
+                <w:szCs w:val="28"/>
+                <w:lang w:val="uz-Cyrl-UZ"/>
+              </w:rPr>
+            </w:pPr>
+          </w:p>
+        </w:tc>
+      </w:tr>
+      <w:tr>
+        <w:trPr>
+          <w:trHeight w:val="384"/>
+        </w:trPr>
+        <w:tc>
+          <w:tcPr>
+            <w:tcW w:w="6804" w:type="dxa"/>
+          </w:tcPr>
+          <w:p>
+            <w:pPr>
+              <w:rPr>
+                <w:bCs/>
+                <w:sz w:val="28"/>
+                <w:szCs w:val="28"/>
+                <w:lang w:val="uz-Cyrl-UZ"/>
+              </w:rPr>
+            </w:pPr>
+            <w:r>
+              <w:rPr>
+                <w:bCs/>
+                <w:sz w:val="28"/>
+                <w:szCs w:val="28"/>
+                <w:lang w:val="uz-Cyrl-UZ"/>
+              </w:rPr>
+              <w:t>Конструктор</w:t>
+            </w:r>
+          </w:p>
+        </w:tc>
+        <w:tc>
+          <w:tcPr>
+            <w:tcW w:w="2268" w:type="dxa"/>
+          </w:tcPr>
+          <w:p>
+            <w:pPr>
+              <w:jc w:val="center"/>
+              <w:rPr>
+                <w:sz w:val="28"/>
+                <w:szCs w:val="28"/>
+              </w:rPr>
+            </w:pPr>
+          </w:p>
+        </w:tc>
+        <w:tc>
+          <w:tcPr>
+            <w:tcW w:w="4219" w:type="dxa"/>
+            <w:vAlign w:val="bottom"/>
+          </w:tcPr>
+          <w:p>
+            <w:pPr>
+              <w:rPr>
+                <w:sz w:val="28"/>
+                <w:szCs w:val="28"/>
+                <w:lang w:val="uz-Cyrl-UZ"/>
+              </w:rPr>
+            </w:pPr>
+            <w:r>
+              <w:rPr>
+                <w:sz w:val="28"/>
+                <w:szCs w:val="28"/>
+                <w:lang w:val="uz-Cyrl-UZ"/>
+              </w:rPr>
+              <w:t xml:space="preserve">                            ______________</w:t>
+            </w:r>
+          </w:p>
+          <w:p>
+            <w:pPr>
+              <w:rPr>
+                <w:sz w:val="28"/>
+                <w:szCs w:val="28"/>
+                <w:lang w:val="uz-Cyrl-UZ"/>
+              </w:rPr>
+            </w:pPr>
           </w:p>
         </w:tc>
       </w:tr>

</xml_diff>

<commit_message>
chore(client): update namuna_meyoriy_sarf.docx template
Co-Authored-By: Claude Opus 4.8 (1M context) <noreply@anthropic.com>
</commit_message>
<xml_diff>
--- a/client/public/namuna_meyoriy_sarf.docx
+++ b/client/public/namuna_meyoriy_sarf.docx
@@ -346,13 +346,15 @@
             </w:pPr>
             <w:r>
               <w:rPr>
+                <w:rFonts w:ascii="Times New Roman" w:hAnsi="Times New Roman" w:cs="Times New Roman"/>
                 <w:b/>
                 <w:bCs/>
                 <w:sz w:val="22"/>
                 <w:szCs w:val="22"/>
-                <w:lang w:val="uz-Cyrl-UZ"/>
-              </w:rPr>
-              <w:t>_______________</w:t>
+                <w:lang w:val="en-US"/>
+                <w:u w:val="single"/>
+              </w:rPr>
+              <w:t xml:space="preserve">               </w:t>
             </w:r>
             <w:r>
               <w:rPr>
@@ -464,13 +466,14 @@
       </w:pPr>
       <w:r>
         <w:rPr>
-          <w:rFonts w:eastAsia="Calibri"/>
+          <w:rFonts w:ascii="Times New Roman" w:hAnsi="Times New Roman" w:cs="Times New Roman" w:eastAsia="Calibri"/>
           <w:b/>
           <w:sz w:val="28"/>
           <w:szCs w:val="28"/>
-          <w:lang w:val="uz-Cyrl-UZ"/>
+          <w:lang w:val="en-US"/>
+          <w:u w:val="single"/>
         </w:rPr>
-        <w:t xml:space="preserve">_______________ </w:t>
+        <w:t xml:space="preserve">                </w:t>
       </w:r>
       <w:r>
         <w:rPr>
@@ -1924,11 +1927,13 @@
             </w:pPr>
             <w:r>
               <w:rPr>
-                <w:sz w:val="28"/>
-                <w:szCs w:val="28"/>
-                <w:lang w:val="uz-Cyrl-UZ"/>
-              </w:rPr>
-              <w:t xml:space="preserve">                            ______________ </w:t>
+                <w:rFonts w:ascii="Times New Roman" w:hAnsi="Times New Roman" w:cs="Times New Roman"/>
+                <w:sz w:val="28"/>
+                <w:szCs w:val="28"/>
+                <w:lang w:val="en-US"/>
+                <w:u w:val="single"/>
+              </w:rPr>
+              <w:t xml:space="preserve">                                           </w:t>
             </w:r>
           </w:p>
         </w:tc>
@@ -2018,18 +2023,23 @@
             </w:pPr>
             <w:r>
               <w:rPr>
-                <w:sz w:val="28"/>
-                <w:szCs w:val="28"/>
-                <w:lang w:val="uz-Cyrl-UZ"/>
+                <w:rFonts w:ascii="Times New Roman" w:hAnsi="Times New Roman" w:cs="Times New Roman"/>
+                <w:sz w:val="28"/>
+                <w:szCs w:val="28"/>
+                <w:u w:val="single"/>
+                <w:lang w:val="en-US"/>
               </w:rPr>
               <w:t xml:space="preserve">                            </w:t>
             </w:r>
             <w:r>
               <w:rPr>
-                <w:sz w:val="28"/>
-                <w:szCs w:val="28"/>
-              </w:rPr>
-              <w:t>______________</w:t>
+                <w:rFonts w:ascii="Times New Roman" w:hAnsi="Times New Roman" w:cs="Times New Roman"/>
+                <w:sz w:val="28"/>
+                <w:szCs w:val="28"/>
+                <w:u w:val="single"/>
+                <w:lang w:val="en-US"/>
+              </w:rPr>
+              <w:t xml:space="preserve">              </w:t>
             </w:r>
             <w:r>
               <w:rPr>
@@ -2128,11 +2138,13 @@
             </w:pPr>
             <w:r>
               <w:rPr>
-                <w:sz w:val="28"/>
-                <w:szCs w:val="28"/>
-                <w:lang w:val="uz-Cyrl-UZ"/>
-              </w:rPr>
-              <w:t xml:space="preserve">                            ______________</w:t>
+                <w:rFonts w:ascii="Times New Roman" w:hAnsi="Times New Roman" w:cs="Times New Roman"/>
+                <w:sz w:val="28"/>
+                <w:szCs w:val="28"/>
+                <w:lang w:val="en-US"/>
+                <w:u w:val="single"/>
+              </w:rPr>
+              <w:t xml:space="preserve">                                          </w:t>
             </w:r>
           </w:p>
           <w:p>
@@ -2203,11 +2215,13 @@
             </w:pPr>
             <w:r>
               <w:rPr>
-                <w:sz w:val="28"/>
-                <w:szCs w:val="28"/>
-                <w:lang w:val="uz-Cyrl-UZ"/>
-              </w:rPr>
-              <w:t xml:space="preserve">                            ______________</w:t>
+                <w:rFonts w:ascii="Times New Roman" w:hAnsi="Times New Roman" w:cs="Times New Roman"/>
+                <w:sz w:val="28"/>
+                <w:szCs w:val="28"/>
+                <w:lang w:val="en-US"/>
+                <w:u w:val="single"/>
+              </w:rPr>
+              <w:t xml:space="preserve">                                          </w:t>
             </w:r>
           </w:p>
           <w:p>
@@ -2278,11 +2292,13 @@
             </w:pPr>
             <w:r>
               <w:rPr>
-                <w:sz w:val="28"/>
-                <w:szCs w:val="28"/>
-                <w:lang w:val="uz-Cyrl-UZ"/>
-              </w:rPr>
-              <w:t xml:space="preserve">                            ______________</w:t>
+                <w:rFonts w:ascii="Times New Roman" w:hAnsi="Times New Roman" w:cs="Times New Roman"/>
+                <w:sz w:val="28"/>
+                <w:szCs w:val="28"/>
+                <w:lang w:val="en-US"/>
+                <w:u w:val="single"/>
+              </w:rPr>
+              <w:t xml:space="preserve">                                          </w:t>
             </w:r>
           </w:p>
           <w:p>

</xml_diff>

<commit_message>
feat(costnorm): assign responsible department per section
Add nullable DepartmentId to CostNormItem (with migration); on save the
section row''s department is copied to its child rows so per-department
consumption queries can group directly. Section headers in the items
table get a department selector when editing and a badge when viewing;
the DOCX export bumps body font to 12pt and unbolds signature rows. Also
drop the now-unused InProgress option from the technical drawings status
filter.

Co-Authored-By: Claude Fable 5 <noreply@anthropic.com>
</commit_message>
<xml_diff>
--- a/client/public/namuna_meyoriy_sarf.docx
+++ b/client/public/namuna_meyoriy_sarf.docx
@@ -508,6 +508,31 @@
         <w:t>сарфи-меёр хужжати</w:t>
       </w:r>
     </w:p>
+    <w:p>
+      <w:pPr>
+        <w:spacing w:before="160" w:after="160"/>
+        <w:jc w:val="left"/>
+      </w:pPr>
+      <w:r>
+        <w:rPr>
+          <w:rFonts w:ascii="Times New Roman" w:hAnsi="Times New Roman" w:cs="Times New Roman"/>
+          <w:b/>
+          <w:i/>
+          <w:sz w:val="22"/>
+          <w:szCs w:val="22"/>
+        </w:rPr>
+        <w:t xml:space="preserve">Eslatma: </w:t>
+      </w:r>
+      <w:r>
+        <w:rPr>
+          <w:rFonts w:ascii="Times New Roman" w:hAnsi="Times New Roman" w:cs="Times New Roman"/>
+          <w:i/>
+          <w:sz w:val="22"/>
+          <w:szCs w:val="22"/>
+        </w:rPr>
+        <w:t xml:space="preserve">Har bir uchastka (bo'lim) nomini jadval ichida — namunadagi «Механика участкаси» kabi — kataklari birlashtirilgan alohida qatorga yozing va materiallarini shu qator ostiga kiriting. Uchastkalar soni cheklanmagan: har biri o'z sarlavha qatori bilan ketma-ket davom etadi. Tizim faylni yuklashda har bir uchastkani mos bo'limga avtomatik biriktiradi (topilmasa qo'lda tanlaysiz).</w:t>
+      </w:r>
+    </w:p>
     <w:tbl>
       <w:tblPr>
         <w:tblW w:w="15920" w:type="dxa"/>
@@ -1736,6 +1761,1201 @@
                 <w:lang w:val="uz-Cyrl-UZ" w:eastAsia="ru-RU"/>
               </w:rPr>
             </w:pPr>
+          </w:p>
+        </w:tc>
+        <w:tc>
+          <w:tcPr>
+            <w:tcW w:w="1568" w:type="dxa"/>
+            <w:shd w:val="clear" w:color="auto" w:fill="auto"/>
+            <w:vAlign w:val="center"/>
+          </w:tcPr>
+          <w:p>
+            <w:pPr>
+              <w:rPr>
+                <w:iCs/>
+                <w:color w:val="000000"/>
+                <w:sz w:val="24"/>
+                <w:szCs w:val="24"/>
+                <w:lang w:val="uz-Cyrl-UZ" w:eastAsia="ru-RU"/>
+              </w:rPr>
+            </w:pPr>
+          </w:p>
+          <w:p>
+            <w:pPr>
+              <w:jc w:val="center"/>
+              <w:rPr>
+                <w:iCs/>
+                <w:color w:val="000000"/>
+                <w:sz w:val="24"/>
+                <w:szCs w:val="24"/>
+                <w:lang w:val="uz-Cyrl-UZ" w:eastAsia="ru-RU"/>
+              </w:rPr>
+            </w:pPr>
+            <w:r>
+              <w:rPr>
+                <w:iCs/>
+                <w:color w:val="000000"/>
+                <w:sz w:val="24"/>
+                <w:szCs w:val="24"/>
+                <w:lang w:eastAsia="ru-RU"/>
+              </w:rPr>
+              <w:t>Местный</w:t>
+            </w:r>
+          </w:p>
+        </w:tc>
+      </w:tr>
+      <w:tr>
+        <w:trPr>
+          <w:trHeight w:val="70"/>
+          <w:jc w:val="center"/>
+        </w:trPr>
+        <w:tc>
+          <w:tcPr>
+            <w:tcW w:w="537" w:type="dxa"/>
+            <w:shd w:val="clear" w:color="auto" w:fill="auto"/>
+            <w:vAlign w:val="center"/>
+          </w:tcPr>
+          <w:p>
+            <w:pPr>
+              <w:pStyle w:val="a4"/>
+              <w:widowControl/>
+              <w:numPr>
+                <w:ilvl w:val="0"/>
+                <w:numId w:val="2"/>
+              </w:numPr>
+              <w:autoSpaceDE/>
+              <w:autoSpaceDN/>
+              <w:contextualSpacing/>
+              <w:jc w:val="center"/>
+              <w:rPr>
+                <w:bCs/>
+                <w:sz w:val="24"/>
+                <w:szCs w:val="24"/>
+                <w:lang w:eastAsia="ru-RU"/>
+              </w:rPr>
+            </w:pPr>
+          </w:p>
+        </w:tc>
+        <w:tc>
+          <w:tcPr>
+            <w:tcW w:w="15383" w:type="dxa"/>
+            <w:gridSpan w:val="8"/>
+            <w:shd w:val="clear" w:color="auto" w:fill="auto"/>
+            <w:vAlign w:val="center"/>
+          </w:tcPr>
+          <w:p>
+            <w:pPr>
+              <w:jc w:val="center"/>
+              <w:rPr>
+                <w:b/>
+                <w:sz w:val="28"/>
+                <w:szCs w:val="28"/>
+                <w:lang w:val="uz-Cyrl-UZ"/>
+              </w:rPr>
+            </w:pPr>
+            <w:r>
+              <w:rPr>
+                <w:b/>
+                <w:sz w:val="28"/>
+                <w:szCs w:val="28"/>
+                <w:lang w:val="uz-Cyrl-UZ"/>
+              </w:rPr>
+              <w:t>Тикув участкаси</w:t>
+            </w:r>
+          </w:p>
+        </w:tc>
+      </w:tr>
+      <w:tr>
+        <w:trPr>
+          <w:trHeight w:val="667"/>
+          <w:jc w:val="center"/>
+        </w:trPr>
+        <w:tc>
+          <w:tcPr>
+            <w:tcW w:w="537" w:type="dxa"/>
+            <w:shd w:val="clear" w:color="auto" w:fill="auto"/>
+            <w:vAlign w:val="center"/>
+          </w:tcPr>
+          <w:p>
+            <w:pPr>
+              <w:pStyle w:val="a4"/>
+              <w:widowControl/>
+              <w:numPr>
+                <w:ilvl w:val="0"/>
+                <w:numId w:val="2"/>
+              </w:numPr>
+              <w:autoSpaceDE/>
+              <w:autoSpaceDN/>
+              <w:contextualSpacing/>
+              <w:jc w:val="center"/>
+              <w:rPr>
+                <w:bCs/>
+                <w:sz w:val="24"/>
+                <w:szCs w:val="24"/>
+                <w:lang w:eastAsia="ru-RU"/>
+              </w:rPr>
+            </w:pPr>
+          </w:p>
+        </w:tc>
+        <w:tc>
+          <w:tcPr>
+            <w:tcW w:w="3257" w:type="dxa"/>
+            <w:shd w:val="clear" w:color="auto" w:fill="auto"/>
+            <w:vAlign w:val="center"/>
+          </w:tcPr>
+          <w:p>
+            <w:pPr>
+              <w:ind w:right="-57"/>
+              <w:jc w:val="center"/>
+              <w:rPr>
+                <w:sz w:val="24"/>
+                <w:szCs w:val="24"/>
+                <w:lang w:val="uz-Cyrl-UZ"/>
+              </w:rPr>
+            </w:pPr>
+            <w:r>
+              <w:rPr>
+                <w:sz w:val="24"/>
+                <w:szCs w:val="24"/>
+              </w:rPr>
+              <w:t xml:space="preserve">Ткань оксфорд 600D</w:t>
+            </w:r>
+            <w:r>
+              <w:rPr>
+                <w:sz w:val="24"/>
+                <w:szCs w:val="24"/>
+                <w:lang w:val="uz-Cyrl-UZ"/>
+              </w:rPr>
+              <w:t/>
+            </w:r>
+          </w:p>
+          <w:p>
+            <w:pPr>
+              <w:ind w:right="-57"/>
+              <w:jc w:val="center"/>
+              <w:rPr>
+                <w:iCs/>
+                <w:sz w:val="24"/>
+                <w:szCs w:val="24"/>
+                <w:lang w:val="uz-Cyrl-UZ" w:eastAsia="ru-RU"/>
+              </w:rPr>
+            </w:pPr>
+            <w:r>
+              <w:rPr>
+                <w:sz w:val="24"/>
+                <w:szCs w:val="24"/>
+                <w:lang w:val="uz-Cyrl-UZ"/>
+              </w:rPr>
+              <w:t/>
+            </w:r>
+            <w:r>
+              <w:rPr>
+                <w:sz w:val="24"/>
+                <w:szCs w:val="24"/>
+                <w:lang w:val="uz-Cyrl-UZ"/>
+              </w:rPr>
+              <w:t xml:space="preserve"/>
+            </w:r>
+          </w:p>
+        </w:tc>
+        <w:tc>
+          <w:tcPr>
+            <w:tcW w:w="709" w:type="dxa"/>
+            <w:shd w:val="clear" w:color="auto" w:fill="auto"/>
+            <w:vAlign w:val="center"/>
+          </w:tcPr>
+          <w:p>
+            <w:pPr>
+              <w:ind w:left="-94" w:right="-97"/>
+              <w:jc w:val="center"/>
+              <w:rPr>
+                <w:iCs/>
+                <w:sz w:val="24"/>
+                <w:szCs w:val="24"/>
+                <w:lang w:val="uz-Cyrl-UZ" w:eastAsia="ru-RU"/>
+              </w:rPr>
+            </w:pPr>
+            <w:r>
+              <w:rPr>
+                <w:iCs/>
+                <w:sz w:val="24"/>
+                <w:szCs w:val="24"/>
+                <w:lang w:val="uz-Cyrl-UZ" w:eastAsia="ru-RU"/>
+              </w:rPr>
+              <w:t>м</w:t>
+            </w:r>
+          </w:p>
+        </w:tc>
+        <w:tc>
+          <w:tcPr>
+            <w:tcW w:w="1855" w:type="dxa"/>
+            <w:shd w:val="clear" w:color="auto" w:fill="auto"/>
+            <w:vAlign w:val="center"/>
+          </w:tcPr>
+          <w:p>
+            <w:pPr>
+              <w:jc w:val="center"/>
+              <w:rPr>
+                <w:sz w:val="24"/>
+                <w:szCs w:val="24"/>
+              </w:rPr>
+            </w:pPr>
+            <w:r>
+              <w:rPr>
+                <w:i/>
+                <w:iCs/>
+                <w:sz w:val="24"/>
+                <w:szCs w:val="24"/>
+                <w:lang w:eastAsia="ru-RU"/>
+              </w:rPr>
+              <w:t>1,5</w:t>
+            </w:r>
+          </w:p>
+        </w:tc>
+        <w:tc>
+          <w:tcPr>
+            <w:tcW w:w="1724" w:type="dxa"/>
+            <w:vAlign w:val="center"/>
+          </w:tcPr>
+          <w:p>
+            <w:pPr>
+              <w:jc w:val="center"/>
+              <w:rPr>
+                <w:sz w:val="24"/>
+                <w:szCs w:val="24"/>
+              </w:rPr>
+            </w:pPr>
+            <w:r>
+              <w:rPr>
+                <w:sz w:val="24"/>
+                <w:szCs w:val="24"/>
+                <w:lang w:val="en-US"/>
+              </w:rPr>
+              <w:t>0,1</w:t>
+            </w:r>
+            <w:r>
+              <w:rPr>
+                <w:sz w:val="24"/>
+                <w:szCs w:val="24"/>
+              </w:rPr>
+              <w:t/>
+            </w:r>
+            <w:r>
+              <w:rPr>
+                <w:sz w:val="24"/>
+                <w:szCs w:val="24"/>
+              </w:rPr>
+              <w:t/>
+            </w:r>
+          </w:p>
+        </w:tc>
+        <w:tc>
+          <w:tcPr>
+            <w:tcW w:w="1946" w:type="dxa"/>
+            <w:shd w:val="clear" w:color="auto" w:fill="auto"/>
+            <w:vAlign w:val="center"/>
+          </w:tcPr>
+          <w:p>
+            <w:pPr>
+              <w:tabs>
+                <w:tab w:val="center" w:pos="1185"/>
+                <w:tab w:val="right" w:pos="2371"/>
+              </w:tabs>
+              <w:jc w:val="center"/>
+              <w:rPr>
+                <w:sz w:val="24"/>
+                <w:szCs w:val="24"/>
+              </w:rPr>
+            </w:pPr>
+            <w:r>
+              <w:rPr>
+                <w:sz w:val="24"/>
+                <w:szCs w:val="24"/>
+              </w:rPr>
+              <w:t>1,6</w:t>
+            </w:r>
+            <w:r>
+              <w:rPr>
+                <w:sz w:val="24"/>
+                <w:szCs w:val="24"/>
+              </w:rPr>
+              <w:t/>
+            </w:r>
+          </w:p>
+        </w:tc>
+        <w:tc>
+          <w:tcPr>
+            <w:tcW w:w="2133" w:type="dxa"/>
+            <w:shd w:val="clear" w:color="auto" w:fill="auto"/>
+            <w:vAlign w:val="center"/>
+          </w:tcPr>
+          <w:p>
+            <w:pPr>
+              <w:jc w:val="center"/>
+              <w:rPr>
+                <w:noProof/>
+                <w:sz w:val="24"/>
+                <w:szCs w:val="24"/>
+                <w:lang w:eastAsia="ru-RU"/>
+              </w:rPr>
+            </w:pPr>
+            <w:r>
+              <w:rPr>
+                <w:iCs/>
+                <w:noProof/>
+                <w:sz w:val="24"/>
+                <w:szCs w:val="24"/>
+                <w:lang w:eastAsia="ru-RU"/>
+              </w:rPr>
+              <w:drawing>
+                <wp:inline distT="0" distB="0" distL="0" distR="0" wp14:anchorId="53F59572" wp14:editId="0F7314FA">
+                  <wp:extent cx="1513701" cy="666750"/>
+                  <wp:effectExtent l="0" t="0" r="0" b="0"/>
+                  <wp:docPr id="13" name="Рисунок 13"/>
+                  <wp:cNvGraphicFramePr>
+                    <a:graphicFrameLocks xmlns:a="http://schemas.openxmlformats.org/drawingml/2006/main" noChangeAspect="1"/>
+                  </wp:cNvGraphicFramePr>
+                  <a:graphic xmlns:a="http://schemas.openxmlformats.org/drawingml/2006/main">
+                    <a:graphicData uri="http://schemas.openxmlformats.org/drawingml/2006/picture">
+                      <pic:pic xmlns:pic="http://schemas.openxmlformats.org/drawingml/2006/picture">
+                        <pic:nvPicPr>
+                          <pic:cNvPr id="0" name="Picture 2"/>
+                          <pic:cNvPicPr>
+                            <a:picLocks noChangeAspect="1" noChangeArrowheads="1"/>
+                          </pic:cNvPicPr>
+                        </pic:nvPicPr>
+                        <pic:blipFill>
+                          <a:blip r:embed="rId9">
+                            <a:extLst>
+                              <a:ext uri="{28A0092B-C50C-407E-A947-70E740481C1C}">
+                                <a14:useLocalDpi xmlns:a14="http://schemas.microsoft.com/office/drawing/2010/main" val="0"/>
+                              </a:ext>
+                            </a:extLst>
+                          </a:blip>
+                          <a:srcRect/>
+                          <a:stretch>
+                            <a:fillRect/>
+                          </a:stretch>
+                        </pic:blipFill>
+                        <pic:spPr bwMode="auto">
+                          <a:xfrm>
+                            <a:off x="0" y="0"/>
+                            <a:ext cx="1548122" cy="681912"/>
+                          </a:xfrm>
+                          <a:prstGeom prst="rect">
+                            <a:avLst/>
+                          </a:prstGeom>
+                          <a:noFill/>
+                        </pic:spPr>
+                      </pic:pic>
+                    </a:graphicData>
+                  </a:graphic>
+                </wp:inline>
+              </w:drawing>
+            </w:r>
+          </w:p>
+        </w:tc>
+        <w:tc>
+          <w:tcPr>
+            <w:tcW w:w="2191" w:type="dxa"/>
+            <w:shd w:val="clear" w:color="auto" w:fill="auto"/>
+            <w:vAlign w:val="center"/>
+          </w:tcPr>
+          <w:p>
+            <w:pPr>
+              <w:rPr>
+                <w:noProof/>
+                <w:sz w:val="24"/>
+                <w:szCs w:val="24"/>
+                <w:lang w:val="uz-Cyrl-UZ" w:eastAsia="ru-RU"/>
+              </w:rPr>
+            </w:pPr>
+            <w:bookmarkStart w:id="0" w:name="_GoBack"/>
+            <w:bookmarkEnd w:id="0"/>
+          </w:p>
+        </w:tc>
+        <w:tc>
+          <w:tcPr>
+            <w:tcW w:w="1568" w:type="dxa"/>
+            <w:shd w:val="clear" w:color="auto" w:fill="auto"/>
+            <w:vAlign w:val="center"/>
+          </w:tcPr>
+          <w:p>
+            <w:pPr>
+              <w:rPr>
+                <w:iCs/>
+                <w:color w:val="000000"/>
+                <w:sz w:val="24"/>
+                <w:szCs w:val="24"/>
+                <w:lang w:val="uz-Cyrl-UZ" w:eastAsia="ru-RU"/>
+              </w:rPr>
+            </w:pPr>
+          </w:p>
+          <w:p>
+            <w:pPr>
+              <w:jc w:val="center"/>
+              <w:rPr>
+                <w:iCs/>
+                <w:color w:val="000000"/>
+                <w:sz w:val="24"/>
+                <w:szCs w:val="24"/>
+                <w:lang w:val="uz-Cyrl-UZ" w:eastAsia="ru-RU"/>
+              </w:rPr>
+            </w:pPr>
+            <w:r>
+              <w:rPr>
+                <w:iCs/>
+                <w:color w:val="000000"/>
+                <w:sz w:val="24"/>
+                <w:szCs w:val="24"/>
+                <w:lang w:eastAsia="ru-RU"/>
+              </w:rPr>
+              <w:t>Импорт</w:t>
+            </w:r>
+          </w:p>
+        </w:tc>
+      </w:tr>
+      <w:tr>
+        <w:trPr>
+          <w:trHeight w:val="667"/>
+          <w:jc w:val="center"/>
+        </w:trPr>
+        <w:tc>
+          <w:tcPr>
+            <w:tcW w:w="537" w:type="dxa"/>
+            <w:shd w:val="clear" w:color="auto" w:fill="auto"/>
+            <w:vAlign w:val="center"/>
+          </w:tcPr>
+          <w:p>
+            <w:pPr>
+              <w:pStyle w:val="a4"/>
+              <w:widowControl/>
+              <w:numPr>
+                <w:ilvl w:val="0"/>
+                <w:numId w:val="2"/>
+              </w:numPr>
+              <w:autoSpaceDE/>
+              <w:autoSpaceDN/>
+              <w:contextualSpacing/>
+              <w:jc w:val="center"/>
+              <w:rPr>
+                <w:bCs/>
+                <w:sz w:val="24"/>
+                <w:szCs w:val="24"/>
+                <w:lang w:eastAsia="ru-RU"/>
+              </w:rPr>
+            </w:pPr>
+          </w:p>
+        </w:tc>
+        <w:tc>
+          <w:tcPr>
+            <w:tcW w:w="3257" w:type="dxa"/>
+            <w:shd w:val="clear" w:color="auto" w:fill="auto"/>
+            <w:vAlign w:val="center"/>
+          </w:tcPr>
+          <w:p>
+            <w:pPr>
+              <w:ind w:right="-57"/>
+              <w:jc w:val="center"/>
+              <w:rPr>
+                <w:sz w:val="24"/>
+                <w:szCs w:val="24"/>
+                <w:lang w:val="uz-Cyrl-UZ"/>
+              </w:rPr>
+            </w:pPr>
+            <w:r>
+              <w:rPr>
+                <w:sz w:val="24"/>
+                <w:szCs w:val="24"/>
+              </w:rPr>
+              <w:t xml:space="preserve">Нить капроновая</w:t>
+            </w:r>
+            <w:r>
+              <w:rPr>
+                <w:sz w:val="24"/>
+                <w:szCs w:val="24"/>
+                <w:lang w:val="uz-Cyrl-UZ"/>
+              </w:rPr>
+              <w:t/>
+            </w:r>
+          </w:p>
+          <w:p>
+            <w:pPr>
+              <w:ind w:right="-57"/>
+              <w:jc w:val="center"/>
+              <w:rPr>
+                <w:iCs/>
+                <w:sz w:val="24"/>
+                <w:szCs w:val="24"/>
+                <w:lang w:val="uz-Cyrl-UZ" w:eastAsia="ru-RU"/>
+              </w:rPr>
+            </w:pPr>
+            <w:r>
+              <w:rPr>
+                <w:sz w:val="24"/>
+                <w:szCs w:val="24"/>
+                <w:lang w:val="uz-Cyrl-UZ"/>
+              </w:rPr>
+              <w:t/>
+            </w:r>
+          </w:p>
+        </w:tc>
+        <w:tc>
+          <w:tcPr>
+            <w:tcW w:w="709" w:type="dxa"/>
+            <w:shd w:val="clear" w:color="auto" w:fill="auto"/>
+            <w:vAlign w:val="center"/>
+          </w:tcPr>
+          <w:p>
+            <w:pPr>
+              <w:ind w:left="-94" w:right="-97"/>
+              <w:jc w:val="center"/>
+              <w:rPr>
+                <w:iCs/>
+                <w:sz w:val="24"/>
+                <w:szCs w:val="24"/>
+                <w:lang w:val="uz-Cyrl-UZ" w:eastAsia="ru-RU"/>
+              </w:rPr>
+            </w:pPr>
+            <w:r>
+              <w:rPr>
+                <w:iCs/>
+                <w:sz w:val="24"/>
+                <w:szCs w:val="24"/>
+                <w:lang w:val="uz-Cyrl-UZ" w:eastAsia="ru-RU"/>
+              </w:rPr>
+              <w:t>м</w:t>
+            </w:r>
+          </w:p>
+        </w:tc>
+        <w:tc>
+          <w:tcPr>
+            <w:tcW w:w="1855" w:type="dxa"/>
+            <w:shd w:val="clear" w:color="auto" w:fill="auto"/>
+            <w:vAlign w:val="center"/>
+          </w:tcPr>
+          <w:p>
+            <w:pPr>
+              <w:jc w:val="center"/>
+              <w:rPr>
+                <w:sz w:val="24"/>
+                <w:szCs w:val="24"/>
+                <w:lang w:val="en-US"/>
+              </w:rPr>
+            </w:pPr>
+            <w:r>
+              <w:rPr>
+                <w:i/>
+                <w:iCs/>
+                <w:sz w:val="24"/>
+                <w:szCs w:val="24"/>
+                <w:lang w:val="en-US" w:eastAsia="ru-RU"/>
+              </w:rPr>
+              <w:t>12</w:t>
+            </w:r>
+            <w:r>
+              <w:rPr>
+                <w:i/>
+                <w:iCs/>
+                <w:sz w:val="24"/>
+                <w:szCs w:val="24"/>
+                <w:lang w:eastAsia="ru-RU"/>
+              </w:rPr>
+              <w:t/>
+            </w:r>
+            <w:r>
+              <w:rPr>
+                <w:i/>
+                <w:iCs/>
+                <w:sz w:val="24"/>
+                <w:szCs w:val="24"/>
+                <w:lang w:val="en-US" w:eastAsia="ru-RU"/>
+              </w:rPr>
+              <w:t/>
+            </w:r>
+          </w:p>
+        </w:tc>
+        <w:tc>
+          <w:tcPr>
+            <w:tcW w:w="1724" w:type="dxa"/>
+            <w:vAlign w:val="center"/>
+          </w:tcPr>
+          <w:p>
+            <w:pPr>
+              <w:jc w:val="center"/>
+              <w:rPr>
+                <w:sz w:val="24"/>
+                <w:szCs w:val="24"/>
+                <w:lang w:val="en-US"/>
+              </w:rPr>
+            </w:pPr>
+            <w:r>
+              <w:rPr>
+                <w:sz w:val="24"/>
+                <w:szCs w:val="24"/>
+                <w:lang w:val="en-US"/>
+              </w:rPr>
+              <w:t>0,5</w:t>
+            </w:r>
+            <w:r>
+              <w:rPr>
+                <w:sz w:val="24"/>
+                <w:szCs w:val="24"/>
+              </w:rPr>
+              <w:t/>
+            </w:r>
+            <w:r>
+              <w:rPr>
+                <w:sz w:val="24"/>
+                <w:szCs w:val="24"/>
+                <w:lang w:val="en-US"/>
+              </w:rPr>
+              <w:t/>
+            </w:r>
+          </w:p>
+        </w:tc>
+        <w:tc>
+          <w:tcPr>
+            <w:tcW w:w="1946" w:type="dxa"/>
+            <w:shd w:val="clear" w:color="auto" w:fill="auto"/>
+            <w:vAlign w:val="center"/>
+          </w:tcPr>
+          <w:p>
+            <w:pPr>
+              <w:tabs>
+                <w:tab w:val="center" w:pos="1185"/>
+                <w:tab w:val="right" w:pos="2371"/>
+              </w:tabs>
+              <w:jc w:val="center"/>
+              <w:rPr>
+                <w:sz w:val="24"/>
+                <w:szCs w:val="24"/>
+                <w:lang w:val="en-US"/>
+              </w:rPr>
+            </w:pPr>
+            <w:r>
+              <w:rPr>
+                <w:sz w:val="24"/>
+                <w:szCs w:val="24"/>
+                <w:lang w:val="en-US"/>
+              </w:rPr>
+              <w:t>12,5</w:t>
+            </w:r>
+            <w:r>
+              <w:rPr>
+                <w:sz w:val="24"/>
+                <w:szCs w:val="24"/>
+              </w:rPr>
+              <w:t/>
+            </w:r>
+            <w:r>
+              <w:rPr>
+                <w:sz w:val="24"/>
+                <w:szCs w:val="24"/>
+                <w:lang w:val="en-US"/>
+              </w:rPr>
+              <w:t/>
+            </w:r>
+          </w:p>
+        </w:tc>
+        <w:tc>
+          <w:tcPr>
+            <w:tcW w:w="2133" w:type="dxa"/>
+            <w:shd w:val="clear" w:color="auto" w:fill="auto"/>
+            <w:vAlign w:val="center"/>
+          </w:tcPr>
+          <w:p>
+            <w:pPr>
+              <w:jc w:val="center"/>
+              <w:rPr>
+                <w:noProof/>
+                <w:sz w:val="24"/>
+                <w:szCs w:val="24"/>
+                <w:lang w:eastAsia="ru-RU"/>
+              </w:rPr>
+            </w:pPr>
+            <w:r>
+              <w:rPr>
+                <w:iCs/>
+                <w:noProof/>
+                <w:sz w:val="24"/>
+                <w:szCs w:val="24"/>
+                <w:lang w:eastAsia="ru-RU"/>
+              </w:rPr>
+              <w:drawing>
+                <wp:inline distT="0" distB="0" distL="0" distR="0" wp14:anchorId="4CF87723" wp14:editId="72FF5C05">
+                  <wp:extent cx="800100" cy="352425"/>
+                  <wp:effectExtent l="0" t="0" r="0" b="9525"/>
+                  <wp:docPr id="6" name="Рисунок 6"/>
+                  <wp:cNvGraphicFramePr>
+                    <a:graphicFrameLocks xmlns:a="http://schemas.openxmlformats.org/drawingml/2006/main" noChangeAspect="1"/>
+                  </wp:cNvGraphicFramePr>
+                  <a:graphic xmlns:a="http://schemas.openxmlformats.org/drawingml/2006/main">
+                    <a:graphicData uri="http://schemas.openxmlformats.org/drawingml/2006/picture">
+                      <pic:pic xmlns:pic="http://schemas.openxmlformats.org/drawingml/2006/picture">
+                        <pic:nvPicPr>
+                          <pic:cNvPr id="0" name="Picture 2"/>
+                          <pic:cNvPicPr>
+                            <a:picLocks noChangeAspect="1" noChangeArrowheads="1"/>
+                          </pic:cNvPicPr>
+                        </pic:nvPicPr>
+                        <pic:blipFill>
+                          <a:blip r:embed="rId9">
+                            <a:extLst>
+                              <a:ext uri="{28A0092B-C50C-407E-A947-70E740481C1C}">
+                                <a14:useLocalDpi xmlns:a14="http://schemas.microsoft.com/office/drawing/2010/main" val="0"/>
+                              </a:ext>
+                            </a:extLst>
+                          </a:blip>
+                          <a:srcRect/>
+                          <a:stretch>
+                            <a:fillRect/>
+                          </a:stretch>
+                        </pic:blipFill>
+                        <pic:spPr bwMode="auto">
+                          <a:xfrm>
+                            <a:off x="0" y="0"/>
+                            <a:ext cx="818293" cy="360439"/>
+                          </a:xfrm>
+                          <a:prstGeom prst="rect">
+                            <a:avLst/>
+                          </a:prstGeom>
+                          <a:noFill/>
+                        </pic:spPr>
+                      </pic:pic>
+                    </a:graphicData>
+                  </a:graphic>
+                </wp:inline>
+              </w:drawing>
+            </w:r>
+          </w:p>
+        </w:tc>
+        <w:tc>
+          <w:tcPr>
+            <w:tcW w:w="2191" w:type="dxa"/>
+            <w:shd w:val="clear" w:color="auto" w:fill="auto"/>
+            <w:vAlign w:val="center"/>
+          </w:tcPr>
+          <w:p>
+            <w:pPr>
+              <w:rPr>
+                <w:noProof/>
+                <w:sz w:val="24"/>
+                <w:szCs w:val="24"/>
+                <w:lang w:val="uz-Cyrl-UZ" w:eastAsia="ru-RU"/>
+              </w:rPr>
+            </w:pPr>
+          </w:p>
+        </w:tc>
+        <w:tc>
+          <w:tcPr>
+            <w:tcW w:w="1568" w:type="dxa"/>
+            <w:shd w:val="clear" w:color="auto" w:fill="auto"/>
+            <w:vAlign w:val="center"/>
+          </w:tcPr>
+          <w:p>
+            <w:pPr>
+              <w:rPr>
+                <w:iCs/>
+                <w:color w:val="000000"/>
+                <w:sz w:val="24"/>
+                <w:szCs w:val="24"/>
+                <w:lang w:val="uz-Cyrl-UZ" w:eastAsia="ru-RU"/>
+              </w:rPr>
+            </w:pPr>
+          </w:p>
+          <w:p>
+            <w:pPr>
+              <w:jc w:val="center"/>
+              <w:rPr>
+                <w:iCs/>
+                <w:color w:val="000000"/>
+                <w:sz w:val="24"/>
+                <w:szCs w:val="24"/>
+                <w:lang w:val="uz-Cyrl-UZ" w:eastAsia="ru-RU"/>
+              </w:rPr>
+            </w:pPr>
+            <w:r>
+              <w:rPr>
+                <w:iCs/>
+                <w:color w:val="000000"/>
+                <w:sz w:val="24"/>
+                <w:szCs w:val="24"/>
+                <w:lang w:eastAsia="ru-RU"/>
+              </w:rPr>
+              <w:t>Местный</w:t>
+            </w:r>
+          </w:p>
+        </w:tc>
+      </w:tr>
+      <w:tr>
+        <w:trPr>
+          <w:trHeight w:val="70"/>
+          <w:jc w:val="center"/>
+        </w:trPr>
+        <w:tc>
+          <w:tcPr>
+            <w:tcW w:w="537" w:type="dxa"/>
+            <w:shd w:val="clear" w:color="auto" w:fill="auto"/>
+            <w:vAlign w:val="center"/>
+          </w:tcPr>
+          <w:p>
+            <w:pPr>
+              <w:pStyle w:val="a4"/>
+              <w:widowControl/>
+              <w:numPr>
+                <w:ilvl w:val="0"/>
+                <w:numId w:val="2"/>
+              </w:numPr>
+              <w:autoSpaceDE/>
+              <w:autoSpaceDN/>
+              <w:contextualSpacing/>
+              <w:jc w:val="center"/>
+              <w:rPr>
+                <w:bCs/>
+                <w:sz w:val="24"/>
+                <w:szCs w:val="24"/>
+                <w:lang w:eastAsia="ru-RU"/>
+              </w:rPr>
+            </w:pPr>
+          </w:p>
+        </w:tc>
+        <w:tc>
+          <w:tcPr>
+            <w:tcW w:w="15383" w:type="dxa"/>
+            <w:gridSpan w:val="8"/>
+            <w:shd w:val="clear" w:color="auto" w:fill="auto"/>
+            <w:vAlign w:val="center"/>
+          </w:tcPr>
+          <w:p>
+            <w:pPr>
+              <w:jc w:val="center"/>
+              <w:rPr>
+                <w:b/>
+                <w:sz w:val="28"/>
+                <w:szCs w:val="28"/>
+                <w:lang w:val="uz-Cyrl-UZ"/>
+              </w:rPr>
+            </w:pPr>
+            <w:r>
+              <w:rPr>
+                <w:b/>
+                <w:sz w:val="28"/>
+                <w:szCs w:val="28"/>
+                <w:lang w:val="uz-Cyrl-UZ"/>
+              </w:rPr>
+              <w:t>Йиғув участкаси</w:t>
+            </w:r>
+          </w:p>
+        </w:tc>
+      </w:tr>
+      <w:tr>
+        <w:trPr>
+          <w:trHeight w:val="667"/>
+          <w:jc w:val="center"/>
+        </w:trPr>
+        <w:tc>
+          <w:tcPr>
+            <w:tcW w:w="537" w:type="dxa"/>
+            <w:shd w:val="clear" w:color="auto" w:fill="auto"/>
+            <w:vAlign w:val="center"/>
+          </w:tcPr>
+          <w:p>
+            <w:pPr>
+              <w:pStyle w:val="a4"/>
+              <w:widowControl/>
+              <w:numPr>
+                <w:ilvl w:val="0"/>
+                <w:numId w:val="2"/>
+              </w:numPr>
+              <w:autoSpaceDE/>
+              <w:autoSpaceDN/>
+              <w:contextualSpacing/>
+              <w:jc w:val="center"/>
+              <w:rPr>
+                <w:bCs/>
+                <w:sz w:val="24"/>
+                <w:szCs w:val="24"/>
+                <w:lang w:eastAsia="ru-RU"/>
+              </w:rPr>
+            </w:pPr>
+          </w:p>
+        </w:tc>
+        <w:tc>
+          <w:tcPr>
+            <w:tcW w:w="3257" w:type="dxa"/>
+            <w:shd w:val="clear" w:color="auto" w:fill="auto"/>
+            <w:vAlign w:val="center"/>
+          </w:tcPr>
+          <w:p>
+            <w:pPr>
+              <w:ind w:right="-57"/>
+              <w:jc w:val="center"/>
+              <w:rPr>
+                <w:sz w:val="24"/>
+                <w:szCs w:val="24"/>
+                <w:lang w:val="uz-Cyrl-UZ"/>
+              </w:rPr>
+            </w:pPr>
+            <w:r>
+              <w:rPr>
+                <w:sz w:val="24"/>
+                <w:szCs w:val="24"/>
+              </w:rPr>
+              <w:t xml:space="preserve">Клепка алюминиевая 4 мм</w:t>
+            </w:r>
+            <w:r>
+              <w:rPr>
+                <w:sz w:val="24"/>
+                <w:szCs w:val="24"/>
+                <w:lang w:val="uz-Cyrl-UZ"/>
+              </w:rPr>
+              <w:t/>
+            </w:r>
+          </w:p>
+          <w:p>
+            <w:pPr>
+              <w:ind w:right="-57"/>
+              <w:jc w:val="center"/>
+              <w:rPr>
+                <w:iCs/>
+                <w:sz w:val="24"/>
+                <w:szCs w:val="24"/>
+                <w:lang w:val="uz-Cyrl-UZ" w:eastAsia="ru-RU"/>
+              </w:rPr>
+            </w:pPr>
+            <w:r>
+              <w:rPr>
+                <w:sz w:val="24"/>
+                <w:szCs w:val="24"/>
+                <w:lang w:val="uz-Cyrl-UZ"/>
+              </w:rPr>
+              <w:t/>
+            </w:r>
+            <w:r>
+              <w:rPr>
+                <w:sz w:val="24"/>
+                <w:szCs w:val="24"/>
+                <w:lang w:val="uz-Cyrl-UZ"/>
+              </w:rPr>
+              <w:t xml:space="preserve"/>
+            </w:r>
+          </w:p>
+        </w:tc>
+        <w:tc>
+          <w:tcPr>
+            <w:tcW w:w="709" w:type="dxa"/>
+            <w:shd w:val="clear" w:color="auto" w:fill="auto"/>
+            <w:vAlign w:val="center"/>
+          </w:tcPr>
+          <w:p>
+            <w:pPr>
+              <w:ind w:left="-94" w:right="-97"/>
+              <w:jc w:val="center"/>
+              <w:rPr>
+                <w:iCs/>
+                <w:sz w:val="24"/>
+                <w:szCs w:val="24"/>
+                <w:lang w:val="uz-Cyrl-UZ" w:eastAsia="ru-RU"/>
+              </w:rPr>
+            </w:pPr>
+            <w:r>
+              <w:rPr>
+                <w:iCs/>
+                <w:sz w:val="24"/>
+                <w:szCs w:val="24"/>
+                <w:lang w:val="uz-Cyrl-UZ" w:eastAsia="ru-RU"/>
+              </w:rPr>
+              <w:t>дона</w:t>
+            </w:r>
+          </w:p>
+        </w:tc>
+        <w:tc>
+          <w:tcPr>
+            <w:tcW w:w="1855" w:type="dxa"/>
+            <w:shd w:val="clear" w:color="auto" w:fill="auto"/>
+            <w:vAlign w:val="center"/>
+          </w:tcPr>
+          <w:p>
+            <w:pPr>
+              <w:jc w:val="center"/>
+              <w:rPr>
+                <w:sz w:val="24"/>
+                <w:szCs w:val="24"/>
+              </w:rPr>
+            </w:pPr>
+            <w:r>
+              <w:rPr>
+                <w:i/>
+                <w:iCs/>
+                <w:sz w:val="24"/>
+                <w:szCs w:val="24"/>
+                <w:lang w:eastAsia="ru-RU"/>
+              </w:rPr>
+              <w:t>8</w:t>
+            </w:r>
+          </w:p>
+        </w:tc>
+        <w:tc>
+          <w:tcPr>
+            <w:tcW w:w="1724" w:type="dxa"/>
+            <w:vAlign w:val="center"/>
+          </w:tcPr>
+          <w:p>
+            <w:pPr>
+              <w:jc w:val="center"/>
+              <w:rPr>
+                <w:sz w:val="24"/>
+                <w:szCs w:val="24"/>
+              </w:rPr>
+            </w:pPr>
+            <w:r>
+              <w:rPr>
+                <w:sz w:val="24"/>
+                <w:szCs w:val="24"/>
+                <w:lang w:val="en-US"/>
+              </w:rPr>
+              <w:t>0</w:t>
+            </w:r>
+            <w:r>
+              <w:rPr>
+                <w:sz w:val="24"/>
+                <w:szCs w:val="24"/>
+              </w:rPr>
+              <w:t/>
+            </w:r>
+            <w:r>
+              <w:rPr>
+                <w:sz w:val="24"/>
+                <w:szCs w:val="24"/>
+              </w:rPr>
+              <w:t/>
+            </w:r>
+          </w:p>
+        </w:tc>
+        <w:tc>
+          <w:tcPr>
+            <w:tcW w:w="1946" w:type="dxa"/>
+            <w:shd w:val="clear" w:color="auto" w:fill="auto"/>
+            <w:vAlign w:val="center"/>
+          </w:tcPr>
+          <w:p>
+            <w:pPr>
+              <w:tabs>
+                <w:tab w:val="center" w:pos="1185"/>
+                <w:tab w:val="right" w:pos="2371"/>
+              </w:tabs>
+              <w:jc w:val="center"/>
+              <w:rPr>
+                <w:sz w:val="24"/>
+                <w:szCs w:val="24"/>
+              </w:rPr>
+            </w:pPr>
+            <w:r>
+              <w:rPr>
+                <w:sz w:val="24"/>
+                <w:szCs w:val="24"/>
+              </w:rPr>
+              <w:t>8</w:t>
+            </w:r>
+            <w:r>
+              <w:rPr>
+                <w:sz w:val="24"/>
+                <w:szCs w:val="24"/>
+              </w:rPr>
+              <w:t/>
+            </w:r>
+          </w:p>
+        </w:tc>
+        <w:tc>
+          <w:tcPr>
+            <w:tcW w:w="2133" w:type="dxa"/>
+            <w:shd w:val="clear" w:color="auto" w:fill="auto"/>
+            <w:vAlign w:val="center"/>
+          </w:tcPr>
+          <w:p>
+            <w:pPr>
+              <w:jc w:val="center"/>
+              <w:rPr>
+                <w:noProof/>
+                <w:sz w:val="24"/>
+                <w:szCs w:val="24"/>
+                <w:lang w:eastAsia="ru-RU"/>
+              </w:rPr>
+            </w:pPr>
+            <w:r>
+              <w:rPr>
+                <w:iCs/>
+                <w:noProof/>
+                <w:sz w:val="24"/>
+                <w:szCs w:val="24"/>
+                <w:lang w:eastAsia="ru-RU"/>
+              </w:rPr>
+              <w:drawing>
+                <wp:inline distT="0" distB="0" distL="0" distR="0" wp14:anchorId="53F59572" wp14:editId="0F7314FA">
+                  <wp:extent cx="1513701" cy="666750"/>
+                  <wp:effectExtent l="0" t="0" r="0" b="0"/>
+                  <wp:docPr id="13" name="Рисунок 13"/>
+                  <wp:cNvGraphicFramePr>
+                    <a:graphicFrameLocks xmlns:a="http://schemas.openxmlformats.org/drawingml/2006/main" noChangeAspect="1"/>
+                  </wp:cNvGraphicFramePr>
+                  <a:graphic xmlns:a="http://schemas.openxmlformats.org/drawingml/2006/main">
+                    <a:graphicData uri="http://schemas.openxmlformats.org/drawingml/2006/picture">
+                      <pic:pic xmlns:pic="http://schemas.openxmlformats.org/drawingml/2006/picture">
+                        <pic:nvPicPr>
+                          <pic:cNvPr id="0" name="Picture 2"/>
+                          <pic:cNvPicPr>
+                            <a:picLocks noChangeAspect="1" noChangeArrowheads="1"/>
+                          </pic:cNvPicPr>
+                        </pic:nvPicPr>
+                        <pic:blipFill>
+                          <a:blip r:embed="rId9">
+                            <a:extLst>
+                              <a:ext uri="{28A0092B-C50C-407E-A947-70E740481C1C}">
+                                <a14:useLocalDpi xmlns:a14="http://schemas.microsoft.com/office/drawing/2010/main" val="0"/>
+                              </a:ext>
+                            </a:extLst>
+                          </a:blip>
+                          <a:srcRect/>
+                          <a:stretch>
+                            <a:fillRect/>
+                          </a:stretch>
+                        </pic:blipFill>
+                        <pic:spPr bwMode="auto">
+                          <a:xfrm>
+                            <a:off x="0" y="0"/>
+                            <a:ext cx="1548122" cy="681912"/>
+                          </a:xfrm>
+                          <a:prstGeom prst="rect">
+                            <a:avLst/>
+                          </a:prstGeom>
+                          <a:noFill/>
+                        </pic:spPr>
+                      </pic:pic>
+                    </a:graphicData>
+                  </a:graphic>
+                </wp:inline>
+              </w:drawing>
+            </w:r>
+          </w:p>
+        </w:tc>
+        <w:tc>
+          <w:tcPr>
+            <w:tcW w:w="2191" w:type="dxa"/>
+            <w:shd w:val="clear" w:color="auto" w:fill="auto"/>
+            <w:vAlign w:val="center"/>
+          </w:tcPr>
+          <w:p>
+            <w:pPr>
+              <w:rPr>
+                <w:noProof/>
+                <w:sz w:val="24"/>
+                <w:szCs w:val="24"/>
+                <w:lang w:val="uz-Cyrl-UZ" w:eastAsia="ru-RU"/>
+              </w:rPr>
+            </w:pPr>
+            <w:bookmarkStart w:id="0" w:name="_GoBack"/>
+            <w:bookmarkEnd w:id="0"/>
           </w:p>
         </w:tc>
         <w:tc>

</xml_diff>